<commit_message>
Knowledge Doc Map: add scope checks section (6.1 Streak system)
Co-Authored-By: Claude Opus 5.5 <noreply@anthropic.com>
</commit_message>
<xml_diff>
--- a/docs/Moore Momentum - Knowledge Doc Map.docx
+++ b/docs/Moore Momentum - Knowledge Doc Map.docx
@@ -226,7 +226,7 @@
         <w:t xml:space="preserve">Updates:</w:t>
       </w:r>
       <w:r>
-        <w:t xml:space="preserve"> I add a new entry to section 6 at the end of each week.</w:t>
+        <w:t xml:space="preserve"> I add a new entry to section 7 at the end of each week.</w:t>
       </w:r>
     </w:p>
     <w:p>
@@ -12907,7 +12907,1065 @@
         <w:pStyle w:val="Heading1"/>
       </w:pPr>
       <w:r>
-        <w:t xml:space="preserve">6. Weekly updates</w:t>
+        <w:t xml:space="preserve">6. Scope checks: your scope vs what's built</w:t>
+      </w:r>
+    </w:p>
+    <w:p>
+      <w:pPr>
+        <w:spacing w:after="140"/>
+      </w:pPr>
+      <w:r>
+        <w:t xml:space="preserve">When you ask "is this built?", I check your scope line by line and record the answer here. ⚠️ marks places where the build follows one of your docs and another doc says something different.</w:t>
+      </w:r>
+    </w:p>
+    <w:p>
+      <w:pPr>
+        <w:pStyle w:val="Heading2"/>
+      </w:pPr>
+      <w:r>
+        <w:t xml:space="preserve">6.1 Streak system</w:t>
+      </w:r>
+    </w:p>
+    <w:p>
+      <w:pPr>
+        <w:spacing w:after="140"/>
+      </w:pPr>
+      <w:r>
+        <w:rPr>
+          <w:b/>
+          <w:bCs/>
+        </w:rPr>
+        <w:t xml:space="preserve">Short answer: yes, it's built.</w:t>
+      </w:r>
+      <w:r>
+        <w:t xml:space="preserve"> It's task #10 (Streaks), plus #16 (missed check-ins) and #17 (Streak Savers). Two points differ between your docs; they're marked ⚠️ below.</w:t>
+      </w:r>
+    </w:p>
+    <w:tbl>
+      <w:tblPr>
+        <w:tblW w:type="dxa" w:w="9360"/>
+        <w:tblBorders>
+          <w:top w:val="single" w:color="auto" w:sz="4"/>
+          <w:left w:val="single" w:color="auto" w:sz="4"/>
+          <w:bottom w:val="single" w:color="auto" w:sz="4"/>
+          <w:right w:val="single" w:color="auto" w:sz="4"/>
+          <w:insideH w:val="single" w:color="auto" w:sz="4"/>
+          <w:insideV w:val="single" w:color="auto" w:sz="4"/>
+        </w:tblBorders>
+        <w:tblLayout w:type="fixed"/>
+      </w:tblPr>
+      <w:tblGrid>
+        <w:gridCol w:w="2500"/>
+        <w:gridCol w:w="3900"/>
+        <w:gridCol w:w="2960"/>
+      </w:tblGrid>
+      <w:tr>
+        <w:trPr>
+          <w:cantSplit/>
+          <w:tblHeader/>
+        </w:trPr>
+        <w:tc>
+          <w:tcPr>
+            <w:tcW w:type="dxa" w:w="2500"/>
+            <w:tcBorders>
+              <w:top w:val="single" w:color="C9D3DF" w:sz="4"/>
+              <w:left w:val="single" w:color="C9D3DF" w:sz="4"/>
+              <w:bottom w:val="single" w:color="C9D3DF" w:sz="4"/>
+              <w:right w:val="single" w:color="C9D3DF" w:sz="4"/>
+            </w:tcBorders>
+            <w:shd w:fill="1F3A5F" w:color="auto" w:val="clear"/>
+            <w:tcMar>
+              <w:top w:type="dxa" w:w="80"/>
+              <w:left w:type="dxa" w:w="110"/>
+              <w:bottom w:type="dxa" w:w="80"/>
+              <w:right w:type="dxa" w:w="110"/>
+            </w:tcMar>
+          </w:tcPr>
+          <w:p>
+            <w:pPr>
+              <w:spacing w:after="0"/>
+            </w:pPr>
+            <w:r>
+              <w:rPr>
+                <w:b/>
+                <w:bCs/>
+                <w:color w:val="FFFFFF"/>
+                <w:sz w:val="20"/>
+                <w:szCs w:val="20"/>
+              </w:rPr>
+              <w:t xml:space="preserve">Your scope</w:t>
+            </w:r>
+          </w:p>
+        </w:tc>
+        <w:tc>
+          <w:tcPr>
+            <w:tcW w:type="dxa" w:w="3900"/>
+            <w:tcBorders>
+              <w:top w:val="single" w:color="C9D3DF" w:sz="4"/>
+              <w:left w:val="single" w:color="C9D3DF" w:sz="4"/>
+              <w:bottom w:val="single" w:color="C9D3DF" w:sz="4"/>
+              <w:right w:val="single" w:color="C9D3DF" w:sz="4"/>
+            </w:tcBorders>
+            <w:shd w:fill="1F3A5F" w:color="auto" w:val="clear"/>
+            <w:tcMar>
+              <w:top w:type="dxa" w:w="80"/>
+              <w:left w:type="dxa" w:w="110"/>
+              <w:bottom w:type="dxa" w:w="80"/>
+              <w:right w:type="dxa" w:w="110"/>
+            </w:tcMar>
+          </w:tcPr>
+          <w:p>
+            <w:pPr>
+              <w:spacing w:after="0"/>
+            </w:pPr>
+            <w:r>
+              <w:rPr>
+                <w:b/>
+                <w:bCs/>
+                <w:color w:val="FFFFFF"/>
+                <w:sz w:val="20"/>
+                <w:szCs w:val="20"/>
+              </w:rPr>
+              <w:t xml:space="preserve">Built?</w:t>
+            </w:r>
+          </w:p>
+        </w:tc>
+        <w:tc>
+          <w:tcPr>
+            <w:tcW w:type="dxa" w:w="2960"/>
+            <w:tcBorders>
+              <w:top w:val="single" w:color="C9D3DF" w:sz="4"/>
+              <w:left w:val="single" w:color="C9D3DF" w:sz="4"/>
+              <w:bottom w:val="single" w:color="C9D3DF" w:sz="4"/>
+              <w:right w:val="single" w:color="C9D3DF" w:sz="4"/>
+            </w:tcBorders>
+            <w:shd w:fill="1F3A5F" w:color="auto" w:val="clear"/>
+            <w:tcMar>
+              <w:top w:type="dxa" w:w="80"/>
+              <w:left w:type="dxa" w:w="110"/>
+              <w:bottom w:type="dxa" w:w="80"/>
+              <w:right w:type="dxa" w:w="110"/>
+            </w:tcMar>
+          </w:tcPr>
+          <w:p>
+            <w:pPr>
+              <w:spacing w:after="0"/>
+            </w:pPr>
+            <w:r>
+              <w:rPr>
+                <w:b/>
+                <w:bCs/>
+                <w:color w:val="FFFFFF"/>
+                <w:sz w:val="20"/>
+                <w:szCs w:val="20"/>
+              </w:rPr>
+              <w:t xml:space="preserve">Where to see it</w:t>
+            </w:r>
+          </w:p>
+        </w:tc>
+      </w:tr>
+      <w:tr>
+        <w:trPr>
+          <w:cantSplit/>
+          <w:tblHeader w:val="off"/>
+        </w:trPr>
+        <w:tc>
+          <w:tcPr>
+            <w:tcW w:type="dxa" w:w="2500"/>
+            <w:tcBorders>
+              <w:top w:val="single" w:color="C9D3DF" w:sz="4"/>
+              <w:left w:val="single" w:color="C9D3DF" w:sz="4"/>
+              <w:bottom w:val="single" w:color="C9D3DF" w:sz="4"/>
+              <w:right w:val="single" w:color="C9D3DF" w:sz="4"/>
+            </w:tcBorders>
+            <w:shd w:fill="F3F6FA" w:color="auto" w:val="clear"/>
+            <w:tcMar>
+              <w:top w:type="dxa" w:w="80"/>
+              <w:left w:type="dxa" w:w="110"/>
+              <w:bottom w:type="dxa" w:w="80"/>
+              <w:right w:type="dxa" w:w="110"/>
+            </w:tcMar>
+          </w:tcPr>
+          <w:p>
+            <w:pPr>
+              <w:spacing w:after="0"/>
+            </w:pPr>
+            <w:r>
+              <w:rPr>
+                <w:b/>
+                <w:bCs/>
+                <w:sz w:val="20"/>
+                <w:szCs w:val="20"/>
+              </w:rPr>
+              <w:t xml:space="preserve">Consecutive weekday check-ins with a 4+ average</w:t>
+            </w:r>
+          </w:p>
+        </w:tc>
+        <w:tc>
+          <w:tcPr>
+            <w:tcW w:type="dxa" w:w="3900"/>
+            <w:tcBorders>
+              <w:top w:val="single" w:color="C9D3DF" w:sz="4"/>
+              <w:left w:val="single" w:color="C9D3DF" w:sz="4"/>
+              <w:bottom w:val="single" w:color="C9D3DF" w:sz="4"/>
+              <w:right w:val="single" w:color="C9D3DF" w:sz="4"/>
+            </w:tcBorders>
+            <w:shd w:fill="F3F6FA" w:color="auto" w:val="clear"/>
+            <w:tcMar>
+              <w:top w:type="dxa" w:w="80"/>
+              <w:left w:type="dxa" w:w="110"/>
+              <w:bottom w:type="dxa" w:w="80"/>
+              <w:right w:type="dxa" w:w="110"/>
+            </w:tcMar>
+          </w:tcPr>
+          <w:p>
+            <w:pPr>
+              <w:spacing w:after="0"/>
+            </w:pPr>
+            <w:r>
+              <w:rPr>
+                <w:sz w:val="20"/>
+                <w:szCs w:val="20"/>
+              </w:rPr>
+              <w:t xml:space="preserve">✅ Yes. The 4.0 average is an admin setting, not fixed in the code.</w:t>
+            </w:r>
+          </w:p>
+        </w:tc>
+        <w:tc>
+          <w:tcPr>
+            <w:tcW w:type="dxa" w:w="2960"/>
+            <w:tcBorders>
+              <w:top w:val="single" w:color="C9D3DF" w:sz="4"/>
+              <w:left w:val="single" w:color="C9D3DF" w:sz="4"/>
+              <w:bottom w:val="single" w:color="C9D3DF" w:sz="4"/>
+              <w:right w:val="single" w:color="C9D3DF" w:sz="4"/>
+            </w:tcBorders>
+            <w:shd w:fill="F3F6FA" w:color="auto" w:val="clear"/>
+            <w:tcMar>
+              <w:top w:type="dxa" w:w="80"/>
+              <w:left w:type="dxa" w:w="110"/>
+              <w:bottom w:type="dxa" w:w="80"/>
+              <w:right w:type="dxa" w:w="110"/>
+            </w:tcMar>
+          </w:tcPr>
+          <w:p>
+            <w:pPr>
+              <w:spacing w:after="0"/>
+            </w:pPr>
+            <w:r>
+              <w:rPr>
+                <w:b/>
+                <w:bCs/>
+                <w:sz w:val="20"/>
+                <w:szCs w:val="20"/>
+              </w:rPr>
+              <w:t xml:space="preserve">Cockpit</w:t>
+            </w:r>
+            <w:r>
+              <w:rPr>
+                <w:sz w:val="20"/>
+                <w:szCs w:val="20"/>
+              </w:rPr>
+              <w:t xml:space="preserve">: the streak bar across the top (phone: top bar). Setting: </w:t>
+            </w:r>
+            <w:r>
+              <w:rPr>
+                <w:b/>
+                <w:bCs/>
+                <w:sz w:val="20"/>
+                <w:szCs w:val="20"/>
+              </w:rPr>
+              <w:t xml:space="preserve">Admin → Economy → Streaks</w:t>
+            </w:r>
+            <w:r>
+              <w:rPr>
+                <w:sz w:val="20"/>
+                <w:szCs w:val="20"/>
+              </w:rPr>
+              <w:t xml:space="preserve">.</w:t>
+            </w:r>
+          </w:p>
+        </w:tc>
+      </w:tr>
+      <w:tr>
+        <w:trPr>
+          <w:cantSplit/>
+          <w:tblHeader w:val="off"/>
+        </w:trPr>
+        <w:tc>
+          <w:tcPr>
+            <w:tcW w:type="dxa" w:w="2500"/>
+            <w:tcBorders>
+              <w:top w:val="single" w:color="C9D3DF" w:sz="4"/>
+              <w:left w:val="single" w:color="C9D3DF" w:sz="4"/>
+              <w:bottom w:val="single" w:color="C9D3DF" w:sz="4"/>
+              <w:right w:val="single" w:color="C9D3DF" w:sz="4"/>
+            </w:tcBorders>
+            <w:tcMar>
+              <w:top w:type="dxa" w:w="80"/>
+              <w:left w:type="dxa" w:w="110"/>
+              <w:bottom w:type="dxa" w:w="80"/>
+              <w:right w:type="dxa" w:w="110"/>
+            </w:tcMar>
+          </w:tcPr>
+          <w:p>
+            <w:pPr>
+              <w:spacing w:after="0"/>
+            </w:pPr>
+            <w:r>
+              <w:rPr>
+                <w:b/>
+                <w:bCs/>
+                <w:sz w:val="20"/>
+                <w:szCs w:val="20"/>
+              </w:rPr>
+              <w:t xml:space="preserve">Milestone rewards at 7, 14, 21, 30, 60, 90, 180 and 365 days</w:t>
+            </w:r>
+          </w:p>
+        </w:tc>
+        <w:tc>
+          <w:tcPr>
+            <w:tcW w:type="dxa" w:w="3900"/>
+            <w:tcBorders>
+              <w:top w:val="single" w:color="C9D3DF" w:sz="4"/>
+              <w:left w:val="single" w:color="C9D3DF" w:sz="4"/>
+              <w:bottom w:val="single" w:color="C9D3DF" w:sz="4"/>
+              <w:right w:val="single" w:color="C9D3DF" w:sz="4"/>
+            </w:tcBorders>
+            <w:tcMar>
+              <w:top w:type="dxa" w:w="80"/>
+              <w:left w:type="dxa" w:w="110"/>
+              <w:bottom w:type="dxa" w:w="80"/>
+              <w:right w:type="dxa" w:w="110"/>
+            </w:tcMar>
+          </w:tcPr>
+          <w:p>
+            <w:pPr>
+              <w:spacing w:after="0"/>
+            </w:pPr>
+            <w:r>
+              <w:rPr>
+                <w:sz w:val="20"/>
+                <w:szCs w:val="20"/>
+              </w:rPr>
+              <w:t xml:space="preserve">⚠️ </w:t>
+            </w:r>
+            <w:r>
+              <w:rPr>
+                <w:b/>
+                <w:bCs/>
+                <w:sz w:val="20"/>
+                <w:szCs w:val="20"/>
+              </w:rPr>
+              <w:t xml:space="preserve">Partly.</w:t>
+            </w:r>
+            <w:r>
+              <w:rPr>
+                <w:sz w:val="20"/>
+                <w:szCs w:val="20"/>
+              </w:rPr>
+              <w:t xml:space="preserve"> Built with the Gamification Mechanics Specs schedule: </w:t>
+            </w:r>
+            <w:r>
+              <w:rPr>
+                <w:b/>
+                <w:bCs/>
+                <w:sz w:val="20"/>
+                <w:szCs w:val="20"/>
+              </w:rPr>
+              <w:t xml:space="preserve">3/7/14/30/60/90/180/365</w:t>
+            </w:r>
+            <w:r>
+              <w:rPr>
+                <w:sz w:val="20"/>
+                <w:szCs w:val="20"/>
+              </w:rPr>
+              <w:t xml:space="preserve"> (no 21-day, plus a 3-day one). Your list matches the </w:t>
+            </w:r>
+            <w:r>
+              <w:rPr>
+                <w:b/>
+                <w:bCs/>
+                <w:sz w:val="20"/>
+                <w:szCs w:val="20"/>
+              </w:rPr>
+              <w:t xml:space="preserve">PRD</w:t>
+            </w:r>
+            <w:r>
+              <w:rPr>
+                <w:sz w:val="20"/>
+                <w:szCs w:val="20"/>
+              </w:rPr>
+              <w:t xml:space="preserve">. The two docs disagree (question 1 below). Credit amounts per milestone are the ones you confirmed.</w:t>
+            </w:r>
+          </w:p>
+        </w:tc>
+        <w:tc>
+          <w:tcPr>
+            <w:tcW w:type="dxa" w:w="2960"/>
+            <w:tcBorders>
+              <w:top w:val="single" w:color="C9D3DF" w:sz="4"/>
+              <w:left w:val="single" w:color="C9D3DF" w:sz="4"/>
+              <w:bottom w:val="single" w:color="C9D3DF" w:sz="4"/>
+              <w:right w:val="single" w:color="C9D3DF" w:sz="4"/>
+            </w:tcBorders>
+            <w:tcMar>
+              <w:top w:type="dxa" w:w="80"/>
+              <w:left w:type="dxa" w:w="110"/>
+              <w:bottom w:type="dxa" w:w="80"/>
+              <w:right w:type="dxa" w:w="110"/>
+            </w:tcMar>
+          </w:tcPr>
+          <w:p>
+            <w:pPr>
+              <w:spacing w:after="0"/>
+            </w:pPr>
+            <w:r>
+              <w:rPr>
+                <w:sz w:val="20"/>
+                <w:szCs w:val="20"/>
+              </w:rPr>
+              <w:t xml:space="preserve">Cockpit streak bar: "N days to X-day reward". The milestone list is editable in </w:t>
+            </w:r>
+            <w:r>
+              <w:rPr>
+                <w:b/>
+                <w:bCs/>
+                <w:sz w:val="20"/>
+                <w:szCs w:val="20"/>
+              </w:rPr>
+              <w:t xml:space="preserve">Admin → Economy → Streaks</w:t>
+            </w:r>
+            <w:r>
+              <w:rPr>
+                <w:sz w:val="20"/>
+                <w:szCs w:val="20"/>
+              </w:rPr>
+              <w:t xml:space="preserve">, so switching schedules needs no code change.</w:t>
+            </w:r>
+          </w:p>
+        </w:tc>
+      </w:tr>
+      <w:tr>
+        <w:trPr>
+          <w:cantSplit/>
+          <w:tblHeader w:val="off"/>
+        </w:trPr>
+        <w:tc>
+          <w:tcPr>
+            <w:tcW w:type="dxa" w:w="2500"/>
+            <w:tcBorders>
+              <w:top w:val="single" w:color="C9D3DF" w:sz="4"/>
+              <w:left w:val="single" w:color="C9D3DF" w:sz="4"/>
+              <w:bottom w:val="single" w:color="C9D3DF" w:sz="4"/>
+              <w:right w:val="single" w:color="C9D3DF" w:sz="4"/>
+            </w:tcBorders>
+            <w:shd w:fill="F3F6FA" w:color="auto" w:val="clear"/>
+            <w:tcMar>
+              <w:top w:type="dxa" w:w="80"/>
+              <w:left w:type="dxa" w:w="110"/>
+              <w:bottom w:type="dxa" w:w="80"/>
+              <w:right w:type="dxa" w:w="110"/>
+            </w:tcMar>
+          </w:tcPr>
+          <w:p>
+            <w:pPr>
+              <w:spacing w:after="0"/>
+            </w:pPr>
+            <w:r>
+              <w:rPr>
+                <w:b/>
+                <w:bCs/>
+                <w:sz w:val="20"/>
+                <w:szCs w:val="20"/>
+              </w:rPr>
+              <w:t xml:space="preserve">Weekend protection</w:t>
+            </w:r>
+          </w:p>
+        </w:tc>
+        <w:tc>
+          <w:tcPr>
+            <w:tcW w:type="dxa" w:w="3900"/>
+            <w:tcBorders>
+              <w:top w:val="single" w:color="C9D3DF" w:sz="4"/>
+              <w:left w:val="single" w:color="C9D3DF" w:sz="4"/>
+              <w:bottom w:val="single" w:color="C9D3DF" w:sz="4"/>
+              <w:right w:val="single" w:color="C9D3DF" w:sz="4"/>
+            </w:tcBorders>
+            <w:shd w:fill="F3F6FA" w:color="auto" w:val="clear"/>
+            <w:tcMar>
+              <w:top w:type="dxa" w:w="80"/>
+              <w:left w:type="dxa" w:w="110"/>
+              <w:bottom w:type="dxa" w:w="80"/>
+              <w:right w:type="dxa" w:w="110"/>
+            </w:tcMar>
+          </w:tcPr>
+          <w:p>
+            <w:pPr>
+              <w:spacing w:after="0"/>
+            </w:pPr>
+            <w:r>
+              <w:rPr>
+                <w:sz w:val="20"/>
+                <w:szCs w:val="20"/>
+              </w:rPr>
+              <w:t xml:space="preserve">✅ Yes. Weekends never count as missed days.</w:t>
+            </w:r>
+          </w:p>
+        </w:tc>
+        <w:tc>
+          <w:tcPr>
+            <w:tcW w:type="dxa" w:w="2960"/>
+            <w:tcBorders>
+              <w:top w:val="single" w:color="C9D3DF" w:sz="4"/>
+              <w:left w:val="single" w:color="C9D3DF" w:sz="4"/>
+              <w:bottom w:val="single" w:color="C9D3DF" w:sz="4"/>
+              <w:right w:val="single" w:color="C9D3DF" w:sz="4"/>
+            </w:tcBorders>
+            <w:shd w:fill="F3F6FA" w:color="auto" w:val="clear"/>
+            <w:tcMar>
+              <w:top w:type="dxa" w:w="80"/>
+              <w:left w:type="dxa" w:w="110"/>
+              <w:bottom w:type="dxa" w:w="80"/>
+              <w:right w:type="dxa" w:w="110"/>
+            </w:tcMar>
+          </w:tcPr>
+          <w:p>
+            <w:pPr>
+              <w:spacing w:after="0"/>
+            </w:pPr>
+            <w:r>
+              <w:rPr>
+                <w:sz w:val="20"/>
+                <w:szCs w:val="20"/>
+              </w:rPr>
+              <w:t xml:space="preserve">Automatic: skip a Saturday or Sunday and the streak stays.</w:t>
+            </w:r>
+          </w:p>
+        </w:tc>
+      </w:tr>
+      <w:tr>
+        <w:trPr>
+          <w:cantSplit/>
+          <w:tblHeader w:val="off"/>
+        </w:trPr>
+        <w:tc>
+          <w:tcPr>
+            <w:tcW w:type="dxa" w:w="2500"/>
+            <w:tcBorders>
+              <w:top w:val="single" w:color="C9D3DF" w:sz="4"/>
+              <w:left w:val="single" w:color="C9D3DF" w:sz="4"/>
+              <w:bottom w:val="single" w:color="C9D3DF" w:sz="4"/>
+              <w:right w:val="single" w:color="C9D3DF" w:sz="4"/>
+            </w:tcBorders>
+            <w:tcMar>
+              <w:top w:type="dxa" w:w="80"/>
+              <w:left w:type="dxa" w:w="110"/>
+              <w:bottom w:type="dxa" w:w="80"/>
+              <w:right w:type="dxa" w:w="110"/>
+            </w:tcMar>
+          </w:tcPr>
+          <w:p>
+            <w:pPr>
+              <w:spacing w:after="0"/>
+            </w:pPr>
+            <w:r>
+              <w:rPr>
+                <w:b/>
+                <w:bCs/>
+                <w:sz w:val="20"/>
+                <w:szCs w:val="20"/>
+              </w:rPr>
+              <w:t xml:space="preserve">Streak Savers</w:t>
+            </w:r>
+          </w:p>
+        </w:tc>
+        <w:tc>
+          <w:tcPr>
+            <w:tcW w:type="dxa" w:w="3900"/>
+            <w:tcBorders>
+              <w:top w:val="single" w:color="C9D3DF" w:sz="4"/>
+              <w:left w:val="single" w:color="C9D3DF" w:sz="4"/>
+              <w:bottom w:val="single" w:color="C9D3DF" w:sz="4"/>
+              <w:right w:val="single" w:color="C9D3DF" w:sz="4"/>
+            </w:tcBorders>
+            <w:tcMar>
+              <w:top w:type="dxa" w:w="80"/>
+              <w:left w:type="dxa" w:w="110"/>
+              <w:bottom w:type="dxa" w:w="80"/>
+              <w:right w:type="dxa" w:w="110"/>
+            </w:tcMar>
+          </w:tcPr>
+          <w:p>
+            <w:pPr>
+              <w:spacing w:after="0"/>
+            </w:pPr>
+            <w:r>
+              <w:rPr>
+                <w:sz w:val="20"/>
+                <w:szCs w:val="20"/>
+              </w:rPr>
+              <w:t xml:space="preserve">✅ Yes (#17). Earned at a </w:t>
+            </w:r>
+            <w:r>
+              <w:rPr>
+                <w:b/>
+                <w:bCs/>
+                <w:sz w:val="20"/>
+                <w:szCs w:val="20"/>
+              </w:rPr>
+              <w:t xml:space="preserve">30-day streak</w:t>
+            </w:r>
+            <w:r>
+              <w:rPr>
+                <w:sz w:val="20"/>
+                <w:szCs w:val="20"/>
+              </w:rPr>
+              <w:t xml:space="preserve">, </w:t>
+            </w:r>
+            <w:r>
+              <w:rPr>
+                <w:b/>
+                <w:bCs/>
+                <w:sz w:val="20"/>
+                <w:szCs w:val="20"/>
+              </w:rPr>
+              <w:t xml:space="preserve">max 1</w:t>
+            </w:r>
+            <w:r>
+              <w:rPr>
+                <w:sz w:val="20"/>
+                <w:szCs w:val="20"/>
+              </w:rPr>
+              <w:t xml:space="preserve"> held, used automatically on a missed weekday. ⚠️ The PRD says max </w:t>
+            </w:r>
+            <w:r>
+              <w:rPr>
+                <w:b/>
+                <w:bCs/>
+                <w:sz w:val="20"/>
+                <w:szCs w:val="20"/>
+              </w:rPr>
+              <w:t xml:space="preserve">3</w:t>
+            </w:r>
+            <w:r>
+              <w:rPr>
+                <w:sz w:val="20"/>
+                <w:szCs w:val="20"/>
+              </w:rPr>
+              <w:t xml:space="preserve"> (question 2 below).</w:t>
+            </w:r>
+          </w:p>
+        </w:tc>
+        <w:tc>
+          <w:tcPr>
+            <w:tcW w:type="dxa" w:w="2960"/>
+            <w:tcBorders>
+              <w:top w:val="single" w:color="C9D3DF" w:sz="4"/>
+              <w:left w:val="single" w:color="C9D3DF" w:sz="4"/>
+              <w:bottom w:val="single" w:color="C9D3DF" w:sz="4"/>
+              <w:right w:val="single" w:color="C9D3DF" w:sz="4"/>
+            </w:tcBorders>
+            <w:tcMar>
+              <w:top w:type="dxa" w:w="80"/>
+              <w:left w:type="dxa" w:w="110"/>
+              <w:bottom w:type="dxa" w:w="80"/>
+              <w:right w:type="dxa" w:w="110"/>
+            </w:tcMar>
+          </w:tcPr>
+          <w:p>
+            <w:pPr>
+              <w:spacing w:after="0"/>
+            </w:pPr>
+            <w:r>
+              <w:rPr>
+                <w:b/>
+                <w:bCs/>
+                <w:sz w:val="20"/>
+                <w:szCs w:val="20"/>
+              </w:rPr>
+              <w:t xml:space="preserve">Cockpit → "Streak Protection" card</w:t>
+            </w:r>
+            <w:r>
+              <w:rPr>
+                <w:sz w:val="20"/>
+                <w:szCs w:val="20"/>
+              </w:rPr>
+              <w:t xml:space="preserve"> (phone: tap the streak). Rules: </w:t>
+            </w:r>
+            <w:r>
+              <w:rPr>
+                <w:b/>
+                <w:bCs/>
+                <w:sz w:val="20"/>
+                <w:szCs w:val="20"/>
+              </w:rPr>
+              <w:t xml:space="preserve">Admin → Economy → Streaks → "Streak rules"</w:t>
+            </w:r>
+            <w:r>
+              <w:rPr>
+                <w:sz w:val="20"/>
+                <w:szCs w:val="20"/>
+              </w:rPr>
+              <w:t xml:space="preserve"> card.</w:t>
+            </w:r>
+          </w:p>
+        </w:tc>
+      </w:tr>
+      <w:tr>
+        <w:trPr>
+          <w:cantSplit/>
+          <w:tblHeader w:val="off"/>
+        </w:trPr>
+        <w:tc>
+          <w:tcPr>
+            <w:tcW w:type="dxa" w:w="2500"/>
+            <w:tcBorders>
+              <w:top w:val="single" w:color="C9D3DF" w:sz="4"/>
+              <w:left w:val="single" w:color="C9D3DF" w:sz="4"/>
+              <w:bottom w:val="single" w:color="C9D3DF" w:sz="4"/>
+              <w:right w:val="single" w:color="C9D3DF" w:sz="4"/>
+            </w:tcBorders>
+            <w:shd w:fill="F3F6FA" w:color="auto" w:val="clear"/>
+            <w:tcMar>
+              <w:top w:type="dxa" w:w="80"/>
+              <w:left w:type="dxa" w:w="110"/>
+              <w:bottom w:type="dxa" w:w="80"/>
+              <w:right w:type="dxa" w:w="110"/>
+            </w:tcMar>
+          </w:tcPr>
+          <w:p>
+            <w:pPr>
+              <w:spacing w:after="0"/>
+            </w:pPr>
+            <w:r>
+              <w:rPr>
+                <w:b/>
+                <w:bCs/>
+                <w:sz w:val="20"/>
+                <w:szCs w:val="20"/>
+              </w:rPr>
+              <w:t xml:space="preserve">Warning after two missed check-ins, before Momentum Points are lost</w:t>
+            </w:r>
+          </w:p>
+        </w:tc>
+        <w:tc>
+          <w:tcPr>
+            <w:tcW w:type="dxa" w:w="3900"/>
+            <w:tcBorders>
+              <w:top w:val="single" w:color="C9D3DF" w:sz="4"/>
+              <w:left w:val="single" w:color="C9D3DF" w:sz="4"/>
+              <w:bottom w:val="single" w:color="C9D3DF" w:sz="4"/>
+              <w:right w:val="single" w:color="C9D3DF" w:sz="4"/>
+            </w:tcBorders>
+            <w:shd w:fill="F3F6FA" w:color="auto" w:val="clear"/>
+            <w:tcMar>
+              <w:top w:type="dxa" w:w="80"/>
+              <w:left w:type="dxa" w:w="110"/>
+              <w:bottom w:type="dxa" w:w="80"/>
+              <w:right w:type="dxa" w:w="110"/>
+            </w:tcMar>
+          </w:tcPr>
+          <w:p>
+            <w:pPr>
+              <w:spacing w:after="0"/>
+            </w:pPr>
+            <w:r>
+              <w:rPr>
+                <w:sz w:val="20"/>
+                <w:szCs w:val="20"/>
+              </w:rPr>
+              <w:t xml:space="preserve">✅ Yes (#16). </w:t>
+            </w:r>
+            <w:r>
+              <w:rPr>
+                <w:b/>
+                <w:bCs/>
+                <w:sz w:val="20"/>
+                <w:szCs w:val="20"/>
+              </w:rPr>
+              <w:t xml:space="preserve">1 missed weekday</w:t>
+            </w:r>
+            <w:r>
+              <w:rPr>
+                <w:sz w:val="20"/>
+                <w:szCs w:val="20"/>
+              </w:rPr>
+              <w:t xml:space="preserve"> → a friendly "Ship Warning" banner (Check in now / Remind me in 1 hour). </w:t>
+            </w:r>
+            <w:r>
+              <w:rPr>
+                <w:b/>
+                <w:bCs/>
+                <w:sz w:val="20"/>
+                <w:szCs w:val="20"/>
+              </w:rPr>
+              <w:t xml:space="preserve">2+ missed</w:t>
+            </w:r>
+            <w:r>
+              <w:rPr>
+                <w:sz w:val="20"/>
+                <w:szCs w:val="20"/>
+              </w:rPr>
+              <w:t xml:space="preserve"> → the "Relaunch" screen. ⚠️ The point-loss penalty exists but is set to </w:t>
+            </w:r>
+            <w:r>
+              <w:rPr>
+                <w:b/>
+                <w:bCs/>
+                <w:sz w:val="20"/>
+                <w:szCs w:val="20"/>
+              </w:rPr>
+              <w:t xml:space="preserve">0</w:t>
+            </w:r>
+            <w:r>
+              <w:rPr>
+                <w:sz w:val="20"/>
+                <w:szCs w:val="20"/>
+              </w:rPr>
+              <w:t xml:space="preserve"> until you choose an amount (question 3 below).</w:t>
+            </w:r>
+          </w:p>
+        </w:tc>
+        <w:tc>
+          <w:tcPr>
+            <w:tcW w:type="dxa" w:w="2960"/>
+            <w:tcBorders>
+              <w:top w:val="single" w:color="C9D3DF" w:sz="4"/>
+              <w:left w:val="single" w:color="C9D3DF" w:sz="4"/>
+              <w:bottom w:val="single" w:color="C9D3DF" w:sz="4"/>
+              <w:right w:val="single" w:color="C9D3DF" w:sz="4"/>
+            </w:tcBorders>
+            <w:shd w:fill="F3F6FA" w:color="auto" w:val="clear"/>
+            <w:tcMar>
+              <w:top w:type="dxa" w:w="80"/>
+              <w:left w:type="dxa" w:w="110"/>
+              <w:bottom w:type="dxa" w:w="80"/>
+              <w:right w:type="dxa" w:w="110"/>
+            </w:tcMar>
+          </w:tcPr>
+          <w:p>
+            <w:pPr>
+              <w:spacing w:after="0"/>
+            </w:pPr>
+            <w:r>
+              <w:rPr>
+                <w:b/>
+                <w:bCs/>
+                <w:sz w:val="20"/>
+                <w:szCs w:val="20"/>
+              </w:rPr>
+              <w:t xml:space="preserve">Cockpit</w:t>
+            </w:r>
+            <w:r>
+              <w:rPr>
+                <w:sz w:val="20"/>
+                <w:szCs w:val="20"/>
+              </w:rPr>
+              <w:t xml:space="preserve"> banner / Relaunch screen. Penalty: </w:t>
+            </w:r>
+            <w:r>
+              <w:rPr>
+                <w:b/>
+                <w:bCs/>
+                <w:sz w:val="20"/>
+                <w:szCs w:val="20"/>
+              </w:rPr>
+              <w:t xml:space="preserve">Admin → Economy → Streaks → "Streak rules" → Relaunch penalty</w:t>
+            </w:r>
+            <w:r>
+              <w:rPr>
+                <w:sz w:val="20"/>
+                <w:szCs w:val="20"/>
+              </w:rPr>
+              <w:t xml:space="preserve">.</w:t>
+            </w:r>
+          </w:p>
+        </w:tc>
+      </w:tr>
+    </w:tbl>
+    <w:p>
+      <w:pPr>
+        <w:spacing w:after="120"/>
+      </w:pPr>
+    </w:p>
+    <w:p>
+      <w:pPr>
+        <w:spacing w:after="140"/>
+      </w:pPr>
+      <w:r>
+        <w:rPr>
+          <w:b/>
+          <w:bCs/>
+        </w:rPr>
+        <w:t xml:space="preserve">Also built:</w:t>
+      </w:r>
+      <w:r>
+        <w:t xml:space="preserve"> </w:t>
+      </w:r>
+      <w:r>
+        <w:rPr>
+          <w:b/>
+          <w:bCs/>
+        </w:rPr>
+        <w:t xml:space="preserve">Vacation Mode</w:t>
+      </w:r>
+      <w:r>
+        <w:t xml:space="preserve">, which pauses the streak for up to 7 days (same Streak Protection card).</w:t>
+      </w:r>
+    </w:p>
+    <w:p>
+      <w:pPr>
+        <w:spacing w:after="140"/>
+      </w:pPr>
+      <w:r>
+        <w:rPr>
+          <w:b/>
+          <w:bCs/>
+        </w:rPr>
+        <w:t xml:space="preserve">How to see it working:</w:t>
+      </w:r>
+    </w:p>
+    <w:p>
+      <w:pPr>
+        <w:pStyle w:val="ListParagraph"/>
+        <w:numPr>
+          <w:ilvl w:val="0"/>
+          <w:numId w:val="2"/>
+        </w:numPr>
+        <w:spacing w:after="80"/>
+      </w:pPr>
+      <w:r>
+        <w:rPr>
+          <w:b/>
+          <w:bCs/>
+        </w:rPr>
+        <w:t xml:space="preserve">Visible right away:</w:t>
+      </w:r>
+      <w:r>
+        <w:t xml:space="preserve"> the streak bar, the Streak Protection card and the Admin Economy settings.</w:t>
+      </w:r>
+    </w:p>
+    <w:p>
+      <w:pPr>
+        <w:pStyle w:val="ListParagraph"/>
+        <w:numPr>
+          <w:ilvl w:val="0"/>
+          <w:numId w:val="2"/>
+        </w:numPr>
+        <w:spacing w:after="80"/>
+      </w:pPr>
+      <w:r>
+        <w:rPr>
+          <w:b/>
+          <w:bCs/>
+        </w:rPr>
+        <w:t xml:space="preserve">Needs a real situation:</w:t>
+      </w:r>
+      <w:r>
+        <w:t xml:space="preserve"> Ship Warning, Relaunch and Streak Savers only appear after real missed weekdays. #16 and #17 pass their tests and are live, but haven't been confirmed end to end on a real account yet. To see them, use a test account that has missed 1–2 weekdays.</w:t>
+      </w:r>
+    </w:p>
+    <w:p>
+      <w:pPr>
+        <w:spacing w:after="140"/>
+      </w:pPr>
+      <w:r>
+        <w:rPr>
+          <w:b/>
+          <w:bCs/>
+        </w:rPr>
+        <w:t xml:space="preserve">Questions for you</w:t>
+      </w:r>
+      <w:r>
+        <w:t xml:space="preserve"> (so the build matches what you want):</w:t>
+      </w:r>
+    </w:p>
+    <w:p>
+      <w:pPr>
+        <w:pStyle w:val="ListParagraph"/>
+        <w:numPr>
+          <w:ilvl w:val="0"/>
+          <w:numId w:val="3"/>
+        </w:numPr>
+        <w:spacing w:after="80"/>
+      </w:pPr>
+      <w:r>
+        <w:t xml:space="preserve">Milestones: </w:t>
+      </w:r>
+      <w:r>
+        <w:rPr>
+          <w:b/>
+          <w:bCs/>
+        </w:rPr>
+        <w:t xml:space="preserve">7/14/21/30…</w:t>
+      </w:r>
+      <w:r>
+        <w:t xml:space="preserve"> (PRD) or </w:t>
+      </w:r>
+      <w:r>
+        <w:rPr>
+          <w:b/>
+          <w:bCs/>
+        </w:rPr>
+        <w:t xml:space="preserve">3/7/14/30…</w:t>
+      </w:r>
+      <w:r>
+        <w:t xml:space="preserve"> (currently built)?</w:t>
+      </w:r>
+    </w:p>
+    <w:p>
+      <w:pPr>
+        <w:pStyle w:val="ListParagraph"/>
+        <w:numPr>
+          <w:ilvl w:val="0"/>
+          <w:numId w:val="3"/>
+        </w:numPr>
+        <w:spacing w:after="80"/>
+      </w:pPr>
+      <w:r>
+        <w:t xml:space="preserve">Streak Savers: can players hold </w:t>
+      </w:r>
+      <w:r>
+        <w:rPr>
+          <w:b/>
+          <w:bCs/>
+        </w:rPr>
+        <w:t xml:space="preserve">1</w:t>
+      </w:r>
+      <w:r>
+        <w:t xml:space="preserve"> or </w:t>
+      </w:r>
+      <w:r>
+        <w:rPr>
+          <w:b/>
+          <w:bCs/>
+        </w:rPr>
+        <w:t xml:space="preserve">3</w:t>
+      </w:r>
+      <w:r>
+        <w:t xml:space="preserve">?</w:t>
+      </w:r>
+    </w:p>
+    <w:p>
+      <w:pPr>
+        <w:pStyle w:val="ListParagraph"/>
+        <w:numPr>
+          <w:ilvl w:val="0"/>
+          <w:numId w:val="3"/>
+        </w:numPr>
+        <w:spacing w:after="80"/>
+      </w:pPr>
+      <w:r>
+        <w:t xml:space="preserve">How many Momentum Points should a player lose after 2 missed check-ins? (Currently 0.)</w:t>
+      </w:r>
+    </w:p>
+    <w:p>
+      <w:pPr>
+        <w:pStyle w:val="Heading1"/>
+      </w:pPr>
+      <w:r>
+        <w:t xml:space="preserve">7. Weekly updates</w:t>
       </w:r>
     </w:p>
     <w:p>
@@ -13222,6 +14280,18 @@
       </w:pPr>
     </w:lvl>
   </w:abstractNum>
+  <w:abstractNum w:abstractNumId="3" w15:restartNumberingAfterBreak="0">
+    <w:multiLevelType w:val="hybridMultilevel"/>
+    <w:lvl w:ilvl="0" w:tentative="1">
+      <w:start w:val="1"/>
+      <w:numFmt w:val="decimal"/>
+      <w:lvlText w:val="%1."/>
+      <w:lvlJc w:val="left"/>
+      <w:pPr>
+        <w:ind w:left="540" w:hanging="300"/>
+      </w:pPr>
+    </w:lvl>
+  </w:abstractNum>
   <w:num w:numId="1">
     <w:abstractNumId w:val="1"/>
     <w:lvlOverride w:ilvl="0">
@@ -13230,6 +14300,12 @@
   </w:num>
   <w:num w:numId="2">
     <w:abstractNumId w:val="2"/>
+    <w:lvlOverride w:ilvl="0">
+      <w:startOverride w:val="1"/>
+    </w:lvlOverride>
+  </w:num>
+  <w:num w:numId="3">
+    <w:abstractNumId w:val="3"/>
     <w:lvlOverride w:ilvl="0">
       <w:startOverride w:val="1"/>
     </w:lvlOverride>

</xml_diff>